<commit_message>
Update GDPR compliance doc: document essay text sanitization pipeline
Co-Authored-By: Claude Sonnet 4.6 <noreply@anthropic.com>
</commit_message>
<xml_diff>
--- a/legal/soulad-se-smernici-ai.docx
+++ b/legal/soulad-se-smernici-ai.docx
@@ -193,6 +193,23 @@
       </w:r>
       <w:r>
         <w:t xml:space="preserve"> v rámci AI volání</w:t>
+      </w:r>
+    </w:p>
+    <w:p/>
+    <w:p>
+      <w:r/>
+      <w:r>
+        <w:rPr>
+          <w:b/>
+        </w:rPr>
+        <w:t>Sanitizace textu esejí před odesláním:</w:t>
+      </w:r>
+      <w:r/>
+    </w:p>
+    <w:p/>
+    <w:p>
+      <w:r>
+        <w:t>Před tím, než text žákovské práce opustí systém, je lokálně sanitizován. Sanitizace odstraňuje a nahrazuje zástupnými výrazy: jména žáků ze třídního seznamu, e-mailové adresy, telefonní čísla, URL adresy, klíčová slova označující citlivé kategorie (zdravotní stav, původ, národnost, náboženství, sportovní klub, zaměstnavatel rodinného příslušníka) a detekované pojmenované entity tam, kde to lokální zpracování textu umožňuje. Teprve sanitizovaný text je poté zkrácen na provozní limit a odeslán do OpenAI. Nativní text žáka zůstává uložen pouze lokálně na serveru.</w:t>
       </w:r>
     </w:p>
     <w:p/>

</xml_diff>